<commit_message>
Update employee document templates
</commit_message>
<xml_diff>
--- a/demo/plantillas/Brothers/4_OFERTA PAQUETE SALARIAL BROTHERS.docx
+++ b/demo/plantillas/Brothers/4_OFERTA PAQUETE SALARIAL BROTHERS.docx
@@ -119,7 +119,7 @@
           <w:rFonts w:ascii="Calibri" w:hAnsi="Calibri" w:cs="Calibri"/>
           <w:noProof/>
         </w:rPr>
-        <w:t>9 de julio de 2026</w:t>
+        <w:t>12 de julio de 2026</w:t>
       </w:r>
       <w:r>
         <w:rPr>
@@ -1030,14 +1030,20 @@
         <w:rPr>
           <w:rFonts w:ascii="Calibri" w:hAnsi="Calibri" w:cs="Calibri"/>
         </w:rPr>
-        <w:t xml:space="preserve">  Brothers and </w:t>
+        <w:t xml:space="preserve"> Brothers and </w:t>
       </w:r>
       <w:proofErr w:type="spellStart"/>
       <w:r>
         <w:rPr>
           <w:rFonts w:ascii="Calibri" w:hAnsi="Calibri" w:cs="Calibri"/>
         </w:rPr>
-        <w:t>Investemts</w:t>
+        <w:t>Invest</w:t>
+      </w:r>
+      <w:r>
+        <w:rPr>
+          <w:rFonts w:ascii="Calibri" w:hAnsi="Calibri" w:cs="Calibri"/>
+        </w:rPr>
+        <w:t>ments</w:t>
       </w:r>
       <w:proofErr w:type="spellEnd"/>
       <w:r>

</xml_diff>